<commit_message>
Update data audit with the 2019-20 spike findings
</commit_message>
<xml_diff>
--- a/deliverables/Cut or Outsourced (Audience Brief and Data Audit).docx
+++ b/deliverables/Cut or Outsourced (Audience Brief and Data Audit).docx
@@ -175,7 +175,7 @@
     </w:p>
     <w:p>
       <w:r>
-        <w:t xml:space="preserve">All processing is in notebooks/data_audit.py, which reads the raw downloads in data/raw and writes five prepared files to data/processed. Raw files were downloaded on 28 September 2026, apart from the two bridging files used for the reconciliation, downloaded on 27 October 2026. Sources: </w:t>
+        <w:t xml:space="preserve">All processing is in notebooks/data_audit.py, which reads the raw downloads in data/raw and writes five prepared files to data/processed. Raw files were downloaded on 28 September 2026, apart from the two bridging files used for the reconciliation and the national accounts investment file (nama_10_an6), downloaded on 27 October 2026. Sources: </w:t>
       </w:r>
       <w:hyperlink r:id="rId9">
         <w:r>
@@ -1079,7 +1079,7 @@
         <w:t xml:space="preserve">Ireland's 2019–2020 spike: </w:t>
       </w:r>
       <w:r>
-        <w:t>Ireland's FIGARO consumption footprint jumps from 63.7 Mt (2018) to 90.7 Mt (2019) and 79.0 Mt (2020), then falls to 58.2 Mt (2021). Our earlier check showed this comes almost entirely from investment (gross fixed capital formation), not household consumption. Irish investment figures in these years are known to be affected by multinational activity, but we have not yet confirmed the cause. We keep the values and will annotate them rather than remove them, since dropping them would hide a real feature of the data.</w:t>
+        <w:t>Ireland's FIGARO consumption footprint jumps from 63.7 Mt (2018) to 90.7 Mt (2019) and 79.0 Mt (2020), then falls to 58.2 Mt (2021). notebooks/investment_spike.py shows the jump is almost entirely investment (gross fixed capital formation): 29.4 Mt in 2018, 55.9 Mt in 2019 and 26.5 Mt in 2021, while household and government spending stay flat. It is imported: investment emissions from Irish industry fell in 2019 (4.6 to 3.3 Mt), while those from the rest of the world, China and the US rose by 8.0, 6.1 and 2.8 Mt. In the national accounts (nama_10_an6), investment in intellectual property rose from EUR 44bn in 2018 to 143bn in 2019 and 117bn in 2020, then 52bn in 2021, and the footprint follows this closely. Why IP investment surged is not something we have checked. We keep the values and will annotate them rather than remove them, and will not draw a trend through 2019-2020.</w:t>
       </w:r>
     </w:p>
     <w:p>

</xml_diff>